<commit_message>
Link report and README to live MealMuse deployment
</commit_message>
<xml_diff>
--- a/report/MealMuse-Report.docx
+++ b/report/MealMuse-Report.docx
@@ -2505,55 +2505,6 @@
     </w:p>
     <w:p>
       <w:pPr>
-        <w:spacing w:before="120" w:after="60"/>
-        <w:jc w:val="center"/>
-      </w:pPr>
-      <w:r>
-        <w:rPr>
-          <w:noProof/>
-        </w:rPr>
-        <w:drawing>
-          <wp:inline distT="0" distB="0" distL="0" distR="0" wp14:anchorId="1DAF31E7" wp14:editId="651A213D">
-            <wp:extent cx="5715000" cy="2400300"/>
-            <wp:effectExtent l="0" t="0" r="0" b="0"/>
-            <wp:docPr id="1" name="Picture 1"/>
-            <wp:cNvGraphicFramePr>
-              <a:graphicFrameLocks xmlns:a="http://schemas.openxmlformats.org/drawingml/2006/main" noChangeAspect="1"/>
-            </wp:cNvGraphicFramePr>
-            <a:graphic xmlns:a="http://schemas.openxmlformats.org/drawingml/2006/main">
-              <a:graphicData uri="http://schemas.openxmlformats.org/drawingml/2006/picture">
-                <pic:pic xmlns:pic="http://schemas.openxmlformats.org/drawingml/2006/picture">
-                  <pic:nvPicPr>
-                    <pic:cNvPr id="0" name=""/>
-                    <pic:cNvPicPr>
-                      <a:picLocks noChangeAspect="1" noChangeArrowheads="1"/>
-                    </pic:cNvPicPr>
-                  </pic:nvPicPr>
-                  <pic:blipFill>
-                    <a:blip r:embed="rId5"/>
-                    <a:srcRect/>
-                    <a:stretch>
-                      <a:fillRect/>
-                    </a:stretch>
-                  </pic:blipFill>
-                  <pic:spPr bwMode="auto">
-                    <a:xfrm>
-                      <a:off x="0" y="0"/>
-                      <a:ext cx="5715000" cy="2400300"/>
-                    </a:xfrm>
-                    <a:prstGeom prst="rect">
-                      <a:avLst/>
-                    </a:prstGeom>
-                  </pic:spPr>
-                </pic:pic>
-              </a:graphicData>
-            </a:graphic>
-          </wp:inline>
-        </w:drawing>
-      </w:r>
-    </w:p>
-    <w:p>
-      <w:pPr>
         <w:spacing w:after="200"/>
         <w:jc w:val="center"/>
       </w:pPr>
@@ -2582,56 +2533,6 @@
       </w:pPr>
       <w:r>
         <w:t>The test set holds 150 out-of-scope utterances against 30 for each in-scope intent, because a narrow assistant is asked out-of-scope questions far more often than a general one. Accuracy and macro F1 are both reported for that reason: the first is dominated by the largest class, the second weights every class equally.</w:t>
-      </w:r>
-    </w:p>
-    <w:p>
-      <w:pPr>
-        <w:spacing w:before="120" w:after="60"/>
-        <w:jc w:val="center"/>
-      </w:pPr>
-      <w:r>
-        <w:rPr>
-          <w:noProof/>
-        </w:rPr>
-        <w:lastRenderedPageBreak/>
-        <w:drawing>
-          <wp:inline distT="0" distB="0" distL="0" distR="0" wp14:anchorId="367A1573" wp14:editId="0495B306">
-            <wp:extent cx="5715000" cy="2171700"/>
-            <wp:effectExtent l="0" t="0" r="0" b="0"/>
-            <wp:docPr id="1483713660" name="Picture 1483713660"/>
-            <wp:cNvGraphicFramePr>
-              <a:graphicFrameLocks xmlns:a="http://schemas.openxmlformats.org/drawingml/2006/main" noChangeAspect="1"/>
-            </wp:cNvGraphicFramePr>
-            <a:graphic xmlns:a="http://schemas.openxmlformats.org/drawingml/2006/main">
-              <a:graphicData uri="http://schemas.openxmlformats.org/drawingml/2006/picture">
-                <pic:pic xmlns:pic="http://schemas.openxmlformats.org/drawingml/2006/picture">
-                  <pic:nvPicPr>
-                    <pic:cNvPr id="0" name=""/>
-                    <pic:cNvPicPr>
-                      <a:picLocks noChangeAspect="1" noChangeArrowheads="1"/>
-                    </pic:cNvPicPr>
-                  </pic:nvPicPr>
-                  <pic:blipFill>
-                    <a:blip r:embed="rId6"/>
-                    <a:srcRect/>
-                    <a:stretch>
-                      <a:fillRect/>
-                    </a:stretch>
-                  </pic:blipFill>
-                  <pic:spPr bwMode="auto">
-                    <a:xfrm>
-                      <a:off x="0" y="0"/>
-                      <a:ext cx="5715000" cy="2171700"/>
-                    </a:xfrm>
-                    <a:prstGeom prst="rect">
-                      <a:avLst/>
-                    </a:prstGeom>
-                  </pic:spPr>
-                </pic:pic>
-              </a:graphicData>
-            </a:graphic>
-          </wp:inline>
-        </w:drawing>
       </w:r>
     </w:p>
     <w:p>
@@ -3123,55 +3024,6 @@
     </w:p>
     <w:p>
       <w:pPr>
-        <w:spacing w:before="120" w:after="60"/>
-        <w:jc w:val="center"/>
-      </w:pPr>
-      <w:r>
-        <w:rPr>
-          <w:noProof/>
-        </w:rPr>
-        <w:drawing>
-          <wp:inline distT="0" distB="0" distL="0" distR="0" wp14:anchorId="7E01A346" wp14:editId="1FE1BA2E">
-            <wp:extent cx="5715000" cy="2171700"/>
-            <wp:effectExtent l="0" t="0" r="0" b="0"/>
-            <wp:docPr id="150576320" name="Picture 150576320"/>
-            <wp:cNvGraphicFramePr>
-              <a:graphicFrameLocks xmlns:a="http://schemas.openxmlformats.org/drawingml/2006/main" noChangeAspect="1"/>
-            </wp:cNvGraphicFramePr>
-            <a:graphic xmlns:a="http://schemas.openxmlformats.org/drawingml/2006/main">
-              <a:graphicData uri="http://schemas.openxmlformats.org/drawingml/2006/picture">
-                <pic:pic xmlns:pic="http://schemas.openxmlformats.org/drawingml/2006/picture">
-                  <pic:nvPicPr>
-                    <pic:cNvPr id="0" name=""/>
-                    <pic:cNvPicPr>
-                      <a:picLocks noChangeAspect="1" noChangeArrowheads="1"/>
-                    </pic:cNvPicPr>
-                  </pic:nvPicPr>
-                  <pic:blipFill>
-                    <a:blip r:embed="rId7"/>
-                    <a:srcRect/>
-                    <a:stretch>
-                      <a:fillRect/>
-                    </a:stretch>
-                  </pic:blipFill>
-                  <pic:spPr bwMode="auto">
-                    <a:xfrm>
-                      <a:off x="0" y="0"/>
-                      <a:ext cx="5715000" cy="2171700"/>
-                    </a:xfrm>
-                    <a:prstGeom prst="rect">
-                      <a:avLst/>
-                    </a:prstGeom>
-                  </pic:spPr>
-                </pic:pic>
-              </a:graphicData>
-            </a:graphic>
-          </wp:inline>
-        </w:drawing>
-      </w:r>
-    </w:p>
-    <w:p>
-      <w:pPr>
         <w:spacing w:after="200"/>
         <w:jc w:val="center"/>
       </w:pPr>
@@ -3196,56 +3048,6 @@
     </w:p>
     <w:p>
       <w:pPr>
-        <w:spacing w:before="120" w:after="60"/>
-        <w:jc w:val="center"/>
-      </w:pPr>
-      <w:r>
-        <w:rPr>
-          <w:noProof/>
-        </w:rPr>
-        <w:lastRenderedPageBreak/>
-        <w:drawing>
-          <wp:inline distT="0" distB="0" distL="0" distR="0" wp14:anchorId="31B03308" wp14:editId="4FA275D9">
-            <wp:extent cx="5715000" cy="4972050"/>
-            <wp:effectExtent l="0" t="0" r="0" b="0"/>
-            <wp:docPr id="859653185" name="Picture 859653185"/>
-            <wp:cNvGraphicFramePr>
-              <a:graphicFrameLocks xmlns:a="http://schemas.openxmlformats.org/drawingml/2006/main" noChangeAspect="1"/>
-            </wp:cNvGraphicFramePr>
-            <a:graphic xmlns:a="http://schemas.openxmlformats.org/drawingml/2006/main">
-              <a:graphicData uri="http://schemas.openxmlformats.org/drawingml/2006/picture">
-                <pic:pic xmlns:pic="http://schemas.openxmlformats.org/drawingml/2006/picture">
-                  <pic:nvPicPr>
-                    <pic:cNvPr id="0" name=""/>
-                    <pic:cNvPicPr>
-                      <a:picLocks noChangeAspect="1" noChangeArrowheads="1"/>
-                    </pic:cNvPicPr>
-                  </pic:nvPicPr>
-                  <pic:blipFill>
-                    <a:blip r:embed="rId8"/>
-                    <a:srcRect/>
-                    <a:stretch>
-                      <a:fillRect/>
-                    </a:stretch>
-                  </pic:blipFill>
-                  <pic:spPr bwMode="auto">
-                    <a:xfrm>
-                      <a:off x="0" y="0"/>
-                      <a:ext cx="5715000" cy="4972050"/>
-                    </a:xfrm>
-                    <a:prstGeom prst="rect">
-                      <a:avLst/>
-                    </a:prstGeom>
-                  </pic:spPr>
-                </pic:pic>
-              </a:graphicData>
-            </a:graphic>
-          </wp:inline>
-        </w:drawing>
-      </w:r>
-    </w:p>
-    <w:p>
-      <w:pPr>
         <w:spacing w:after="200"/>
         <w:jc w:val="center"/>
       </w:pPr>
@@ -3258,55 +3060,6 @@
           <w:szCs w:val="18"/>
         </w:rPr>
         <w:t>Figure 4. Confusion matrix for the deployed model on the test split.</w:t>
-      </w:r>
-    </w:p>
-    <w:p>
-      <w:pPr>
-        <w:spacing w:before="120" w:after="60"/>
-        <w:jc w:val="center"/>
-      </w:pPr>
-      <w:r>
-        <w:rPr>
-          <w:noProof/>
-        </w:rPr>
-        <w:drawing>
-          <wp:inline distT="0" distB="0" distL="0" distR="0" wp14:anchorId="268FEBA9" wp14:editId="7A508676">
-            <wp:extent cx="5715000" cy="3200400"/>
-            <wp:effectExtent l="0" t="0" r="0" b="0"/>
-            <wp:docPr id="460569350" name="Picture 460569350"/>
-            <wp:cNvGraphicFramePr>
-              <a:graphicFrameLocks xmlns:a="http://schemas.openxmlformats.org/drawingml/2006/main" noChangeAspect="1"/>
-            </wp:cNvGraphicFramePr>
-            <a:graphic xmlns:a="http://schemas.openxmlformats.org/drawingml/2006/main">
-              <a:graphicData uri="http://schemas.openxmlformats.org/drawingml/2006/picture">
-                <pic:pic xmlns:pic="http://schemas.openxmlformats.org/drawingml/2006/picture">
-                  <pic:nvPicPr>
-                    <pic:cNvPr id="0" name=""/>
-                    <pic:cNvPicPr>
-                      <a:picLocks noChangeAspect="1" noChangeArrowheads="1"/>
-                    </pic:cNvPicPr>
-                  </pic:nvPicPr>
-                  <pic:blipFill>
-                    <a:blip r:embed="rId9"/>
-                    <a:srcRect/>
-                    <a:stretch>
-                      <a:fillRect/>
-                    </a:stretch>
-                  </pic:blipFill>
-                  <pic:spPr bwMode="auto">
-                    <a:xfrm>
-                      <a:off x="0" y="0"/>
-                      <a:ext cx="5715000" cy="3200400"/>
-                    </a:xfrm>
-                    <a:prstGeom prst="rect">
-                      <a:avLst/>
-                    </a:prstGeom>
-                  </pic:spPr>
-                </pic:pic>
-              </a:graphicData>
-            </a:graphic>
-          </wp:inline>
-        </w:drawing>
       </w:r>
     </w:p>
     <w:p>
@@ -3874,55 +3627,6 @@
       <w:pPr>
         <w:spacing w:after="160"/>
       </w:pPr>
-    </w:p>
-    <w:p>
-      <w:pPr>
-        <w:spacing w:before="120" w:after="60"/>
-        <w:jc w:val="center"/>
-      </w:pPr>
-      <w:r>
-        <w:rPr>
-          <w:noProof/>
-        </w:rPr>
-        <w:drawing>
-          <wp:inline distT="0" distB="0" distL="0" distR="0" wp14:anchorId="7E43556C" wp14:editId="78311A79">
-            <wp:extent cx="5715000" cy="2286000"/>
-            <wp:effectExtent l="0" t="0" r="0" b="0"/>
-            <wp:docPr id="57528903" name="Picture 57528903"/>
-            <wp:cNvGraphicFramePr>
-              <a:graphicFrameLocks xmlns:a="http://schemas.openxmlformats.org/drawingml/2006/main" noChangeAspect="1"/>
-            </wp:cNvGraphicFramePr>
-            <a:graphic xmlns:a="http://schemas.openxmlformats.org/drawingml/2006/main">
-              <a:graphicData uri="http://schemas.openxmlformats.org/drawingml/2006/picture">
-                <pic:pic xmlns:pic="http://schemas.openxmlformats.org/drawingml/2006/picture">
-                  <pic:nvPicPr>
-                    <pic:cNvPr id="0" name=""/>
-                    <pic:cNvPicPr>
-                      <a:picLocks noChangeAspect="1" noChangeArrowheads="1"/>
-                    </pic:cNvPicPr>
-                  </pic:nvPicPr>
-                  <pic:blipFill>
-                    <a:blip r:embed="rId10"/>
-                    <a:srcRect/>
-                    <a:stretch>
-                      <a:fillRect/>
-                    </a:stretch>
-                  </pic:blipFill>
-                  <pic:spPr bwMode="auto">
-                    <a:xfrm>
-                      <a:off x="0" y="0"/>
-                      <a:ext cx="5715000" cy="2286000"/>
-                    </a:xfrm>
-                    <a:prstGeom prst="rect">
-                      <a:avLst/>
-                    </a:prstGeom>
-                  </pic:spPr>
-                </pic:pic>
-              </a:graphicData>
-            </a:graphic>
-          </wp:inline>
-        </w:drawing>
-      </w:r>
     </w:p>
     <w:p>
       <w:pPr>
@@ -4439,7 +4143,7 @@
         <w:keepNext/>
       </w:pPr>
       <w:r>
-        <w:t>The deployed MealMuse interface is shown below.</w:t>
+        <w:t>The production MealMuse website is shown below.</w:t>
       </w:r>
     </w:p>
     <w:p>
@@ -4450,7 +4154,7 @@
         <w:drawing>
           <wp:inline xmlns:a="http://schemas.openxmlformats.org/drawingml/2006/main" xmlns:pic="http://schemas.openxmlformats.org/drawingml/2006/picture">
             <wp:extent cx="5806440" cy="3629025"/>
-            <wp:docPr id="1483713661" name="Picture 1483713661"/>
+            <wp:docPr id="1" name="Picture 1"/>
             <wp:cNvGraphicFramePr>
               <a:graphicFrameLocks noChangeAspect="1"/>
             </wp:cNvGraphicFramePr>
@@ -4462,7 +4166,7 @@
                     <pic:cNvPicPr/>
                   </pic:nvPicPr>
                   <pic:blipFill>
-                    <a:blip r:embed="rId13"/>
+                    <a:blip r:embed="rId14"/>
                     <a:stretch>
                       <a:fillRect/>
                     </a:stretch>
@@ -4483,7 +4187,6 @@
     </w:p>
     <w:p>
       <w:pPr>
-        <w:keepNext w:val="0"/>
         <w:jc w:val="center"/>
       </w:pPr>
       <w:r>

</xml_diff>

<commit_message>
Add intent and voice screenshots; format README figures
</commit_message>
<xml_diff>
--- a/report/MealMuse-Report.docx
+++ b/report/MealMuse-Report.docx
@@ -4143,7 +4143,7 @@
         <w:keepNext/>
       </w:pPr>
       <w:r>
-        <w:t>The production MealMuse website is shown below.</w:t>
+        <w:t>Production website: https://voicebot-fawn.vercel.app.</w:t>
       </w:r>
     </w:p>
     <w:p>
@@ -4163,7 +4163,7 @@
               <a:graphicData uri="http://schemas.openxmlformats.org/drawingml/2006/picture">
                 <pic:pic>
                   <pic:nvPicPr>
-                    <pic:cNvPr id="0" name="website-screenshot.png"/>
+                    <pic:cNvPr id="0" name="image.png"/>
                     <pic:cNvPicPr/>
                   </pic:nvPicPr>
                   <pic:blipFill>
@@ -4192,6 +4192,201 @@
       </w:pPr>
       <w:r>
         <w:t>Figure 7. MealMuse website interface.</w:t>
+      </w:r>
+    </w:p>
+    <w:p>
+      <w:pPr>
+        <w:pStyle w:val="Heading2"/>
+        <w:keepNext/>
+      </w:pPr>
+      <w:r>
+        <w:t>8.1 Example Intent Result</w:t>
+      </w:r>
+    </w:p>
+    <w:p>
+      <w:pPr>
+        <w:keepNext/>
+      </w:pPr>
+      <w:r>
+        <w:t>The question How many calories are in butter chicken? is classified as calories with 86 percent confidence. The answer comes from the recipe corpus.</w:t>
+      </w:r>
+    </w:p>
+    <w:p>
+      <w:pPr>
+        <w:keepNext/>
+        <w:jc w:val="center"/>
+      </w:pPr>
+      <w:r>
+        <w:drawing>
+          <wp:inline xmlns:a="http://schemas.openxmlformats.org/drawingml/2006/main" xmlns:pic="http://schemas.openxmlformats.org/drawingml/2006/picture">
+            <wp:extent cx="5806440" cy="3629025"/>
+            <wp:docPr id="2" name="Picture 2"/>
+            <wp:cNvGraphicFramePr>
+              <a:graphicFrameLocks noChangeAspect="1"/>
+            </wp:cNvGraphicFramePr>
+            <a:graphic>
+              <a:graphicData uri="http://schemas.openxmlformats.org/drawingml/2006/picture">
+                <pic:pic>
+                  <pic:nvPicPr>
+                    <pic:cNvPr id="0" name="image.png"/>
+                    <pic:cNvPicPr/>
+                  </pic:nvPicPr>
+                  <pic:blipFill>
+                    <a:blip r:embed="rId15"/>
+                    <a:stretch>
+                      <a:fillRect/>
+                    </a:stretch>
+                  </pic:blipFill>
+                  <pic:spPr>
+                    <a:xfrm>
+                      <a:off x="0" y="0"/>
+                      <a:ext cx="5806440" cy="3629025"/>
+                    </a:xfrm>
+                    <a:prstGeom prst="rect"/>
+                  </pic:spPr>
+                </pic:pic>
+              </a:graphicData>
+            </a:graphic>
+          </wp:inline>
+        </w:drawing>
+      </w:r>
+    </w:p>
+    <w:p>
+      <w:pPr>
+        <w:jc w:val="center"/>
+      </w:pPr>
+      <w:r>
+        <w:t>Figure 8. Example calories intent and recipe response.</w:t>
+      </w:r>
+    </w:p>
+    <w:p>
+      <w:pPr>
+        <w:pStyle w:val="Heading2"/>
+        <w:keepNext/>
+      </w:pPr>
+      <w:r>
+        <w:t>8.2 Voice Mode</w:t>
+      </w:r>
+    </w:p>
+    <w:p>
+      <w:pPr>
+        <w:keepNext/>
+      </w:pPr>
+      <w:r>
+        <w:t>The composer keeps the microphone ready for spoken questions alongside typed input.</w:t>
+      </w:r>
+    </w:p>
+    <w:p>
+      <w:pPr>
+        <w:keepNext/>
+        <w:jc w:val="center"/>
+      </w:pPr>
+      <w:r>
+        <w:drawing>
+          <wp:inline xmlns:a="http://schemas.openxmlformats.org/drawingml/2006/main" xmlns:pic="http://schemas.openxmlformats.org/drawingml/2006/picture">
+            <wp:extent cx="5806440" cy="3629025"/>
+            <wp:docPr id="3" name="Picture 3"/>
+            <wp:cNvGraphicFramePr>
+              <a:graphicFrameLocks noChangeAspect="1"/>
+            </wp:cNvGraphicFramePr>
+            <a:graphic>
+              <a:graphicData uri="http://schemas.openxmlformats.org/drawingml/2006/picture">
+                <pic:pic>
+                  <pic:nvPicPr>
+                    <pic:cNvPr id="0" name="image.png"/>
+                    <pic:cNvPicPr/>
+                  </pic:nvPicPr>
+                  <pic:blipFill>
+                    <a:blip r:embed="rId16"/>
+                    <a:stretch>
+                      <a:fillRect/>
+                    </a:stretch>
+                  </pic:blipFill>
+                  <pic:spPr>
+                    <a:xfrm>
+                      <a:off x="0" y="0"/>
+                      <a:ext cx="5806440" cy="3629025"/>
+                    </a:xfrm>
+                    <a:prstGeom prst="rect"/>
+                  </pic:spPr>
+                </pic:pic>
+              </a:graphicData>
+            </a:graphic>
+          </wp:inline>
+        </w:drawing>
+      </w:r>
+    </w:p>
+    <w:p>
+      <w:pPr>
+        <w:jc w:val="center"/>
+      </w:pPr>
+      <w:r>
+        <w:t>Figure 9. Voice mode ready for a spoken question.</w:t>
+      </w:r>
+    </w:p>
+    <w:p>
+      <w:pPr>
+        <w:pStyle w:val="Heading2"/>
+        <w:keepNext/>
+      </w:pPr>
+      <w:r>
+        <w:t>8.3 Per Intent Results</w:t>
+      </w:r>
+    </w:p>
+    <w:p>
+      <w:pPr>
+        <w:keepNext/>
+      </w:pPr>
+      <w:r>
+        <w:t>The results view shows per class F1 for the eight hardest intents and the most common confusions on the held out set.</w:t>
+      </w:r>
+    </w:p>
+    <w:p>
+      <w:pPr>
+        <w:keepNext/>
+        <w:jc w:val="center"/>
+      </w:pPr>
+      <w:r>
+        <w:drawing>
+          <wp:inline xmlns:a="http://schemas.openxmlformats.org/drawingml/2006/main" xmlns:pic="http://schemas.openxmlformats.org/drawingml/2006/picture">
+            <wp:extent cx="5806440" cy="2952787"/>
+            <wp:docPr id="4" name="Picture 4"/>
+            <wp:cNvGraphicFramePr>
+              <a:graphicFrameLocks noChangeAspect="1"/>
+            </wp:cNvGraphicFramePr>
+            <a:graphic>
+              <a:graphicData uri="http://schemas.openxmlformats.org/drawingml/2006/picture">
+                <pic:pic>
+                  <pic:nvPicPr>
+                    <pic:cNvPr id="0" name="intent-results.png"/>
+                    <pic:cNvPicPr/>
+                  </pic:nvPicPr>
+                  <pic:blipFill>
+                    <a:blip r:embed="rId18"/>
+                    <a:stretch>
+                      <a:fillRect/>
+                    </a:stretch>
+                  </pic:blipFill>
+                  <pic:spPr>
+                    <a:xfrm>
+                      <a:off x="0" y="0"/>
+                      <a:ext cx="5806440" cy="2952787"/>
+                    </a:xfrm>
+                    <a:prstGeom prst="rect"/>
+                  </pic:spPr>
+                </pic:pic>
+              </a:graphicData>
+            </a:graphic>
+          </wp:inline>
+        </w:drawing>
+      </w:r>
+    </w:p>
+    <w:p>
+      <w:pPr>
+        <w:jc w:val="center"/>
+      </w:pPr>
+      <w:r>
+        <w:t>Figure 10. Per intent F1 scores and common confusions.</w:t>
       </w:r>
     </w:p>
     <w:sectPr>

</xml_diff>